<commit_message>
Update output document with GitHub link
</commit_message>
<xml_diff>
--- a/output.docx
+++ b/output.docx
@@ -16,15 +16,7 @@
           <w:sz w:val="36"/>
           <w:szCs w:val="36"/>
         </w:rPr>
-        <w:t xml:space="preserve">                 </w:t>
-      </w:r>
-      <w:r>
-        <w:rPr>
-          <w:rFonts w:ascii="Times New Roman" w:hAnsi="Times New Roman" w:cs="Times New Roman"/>
-          <w:sz w:val="36"/>
-          <w:szCs w:val="36"/>
-        </w:rPr>
-        <w:t>SECURE PRODUCT CATALOG API</w:t>
+        <w:t xml:space="preserve">                 SECURE PRODUCT CATALOG API</w:t>
       </w:r>
     </w:p>
     <w:p>
@@ -88,6 +80,7 @@
       <w:r>
         <w:rPr>
           <w:rFonts w:ascii="Times New Roman" w:hAnsi="Times New Roman" w:cs="Times New Roman"/>
+          <w:noProof/>
           <w:sz w:val="36"/>
           <w:szCs w:val="36"/>
         </w:rPr>
@@ -184,6 +177,7 @@
       <w:r>
         <w:rPr>
           <w:rFonts w:ascii="Times New Roman" w:hAnsi="Times New Roman" w:cs="Times New Roman"/>
+          <w:noProof/>
           <w:sz w:val="36"/>
           <w:szCs w:val="36"/>
         </w:rPr>
@@ -248,6 +242,7 @@
       <w:r>
         <w:rPr>
           <w:rFonts w:ascii="Times New Roman" w:hAnsi="Times New Roman" w:cs="Times New Roman"/>
+          <w:noProof/>
           <w:sz w:val="36"/>
           <w:szCs w:val="36"/>
         </w:rPr>
@@ -345,6 +340,7 @@
       <w:r>
         <w:rPr>
           <w:rFonts w:ascii="Times New Roman" w:hAnsi="Times New Roman" w:cs="Times New Roman"/>
+          <w:noProof/>
           <w:sz w:val="36"/>
           <w:szCs w:val="36"/>
         </w:rPr>
@@ -427,6 +423,7 @@
       <w:r>
         <w:rPr>
           <w:rFonts w:ascii="Times New Roman" w:hAnsi="Times New Roman" w:cs="Times New Roman"/>
+          <w:noProof/>
           <w:sz w:val="36"/>
           <w:szCs w:val="36"/>
         </w:rPr>
@@ -509,47 +506,7 @@
           <w:sz w:val="36"/>
           <w:szCs w:val="36"/>
         </w:rPr>
-        <w:t>POST</w:t>
-      </w:r>
-      <w:r>
-        <w:rPr>
-          <w:rFonts w:ascii="Times New Roman" w:hAnsi="Times New Roman" w:cs="Times New Roman"/>
-          <w:b/>
-          <w:bCs/>
-          <w:sz w:val="36"/>
-          <w:szCs w:val="36"/>
-        </w:rPr>
-        <w:t xml:space="preserve"> </w:t>
-      </w:r>
-      <w:r>
-        <w:rPr>
-          <w:rFonts w:ascii="Times New Roman" w:hAnsi="Times New Roman" w:cs="Times New Roman"/>
-          <w:b/>
-          <w:bCs/>
-          <w:sz w:val="36"/>
-          <w:szCs w:val="36"/>
-        </w:rPr>
-        <w:t xml:space="preserve"> </w:t>
-      </w:r>
-      <w:r>
-        <w:rPr>
-          <w:rFonts w:ascii="Times New Roman" w:hAnsi="Times New Roman" w:cs="Times New Roman"/>
-          <w:b/>
-          <w:bCs/>
-          <w:sz w:val="36"/>
-          <w:szCs w:val="36"/>
-        </w:rPr>
-        <w:t>P</w:t>
-      </w:r>
-      <w:r>
-        <w:rPr>
-          <w:rFonts w:ascii="Times New Roman" w:hAnsi="Times New Roman" w:cs="Times New Roman"/>
-          <w:b/>
-          <w:bCs/>
-          <w:sz w:val="36"/>
-          <w:szCs w:val="36"/>
-        </w:rPr>
-        <w:t>roduct</w:t>
+        <w:t>POST  Product</w:t>
       </w:r>
       <w:proofErr w:type="gramEnd"/>
     </w:p>
@@ -564,6 +521,7 @@
       <w:r>
         <w:rPr>
           <w:rFonts w:ascii="Times New Roman" w:hAnsi="Times New Roman" w:cs="Times New Roman"/>
+          <w:noProof/>
           <w:sz w:val="36"/>
           <w:szCs w:val="36"/>
         </w:rPr>
@@ -628,6 +586,7 @@
       <w:r>
         <w:rPr>
           <w:rFonts w:ascii="Times New Roman" w:hAnsi="Times New Roman" w:cs="Times New Roman"/>
+          <w:noProof/>
           <w:sz w:val="36"/>
           <w:szCs w:val="36"/>
         </w:rPr>
@@ -718,40 +677,21 @@
           <w:sz w:val="36"/>
           <w:szCs w:val="36"/>
         </w:rPr>
-        <w:t xml:space="preserve">PUT </w:t>
-      </w:r>
-      <w:r>
-        <w:rPr>
-          <w:rFonts w:ascii="Times New Roman" w:hAnsi="Times New Roman" w:cs="Times New Roman"/>
-          <w:b/>
-          <w:bCs/>
-          <w:sz w:val="36"/>
-          <w:szCs w:val="36"/>
-        </w:rPr>
-        <w:t>P</w:t>
-      </w:r>
-      <w:r>
-        <w:rPr>
-          <w:rFonts w:ascii="Times New Roman" w:hAnsi="Times New Roman" w:cs="Times New Roman"/>
-          <w:b/>
-          <w:bCs/>
-          <w:sz w:val="36"/>
-          <w:szCs w:val="36"/>
-        </w:rPr>
-        <w:t>roduct</w:t>
-      </w:r>
-    </w:p>
-    <w:p>
-      <w:pPr>
-        <w:rPr>
-          <w:rFonts w:ascii="Times New Roman" w:hAnsi="Times New Roman" w:cs="Times New Roman"/>
-          <w:sz w:val="36"/>
-          <w:szCs w:val="36"/>
-        </w:rPr>
-      </w:pPr>
-      <w:r>
-        <w:rPr>
-          <w:rFonts w:ascii="Times New Roman" w:hAnsi="Times New Roman" w:cs="Times New Roman"/>
+        <w:t>PUT Product</w:t>
+      </w:r>
+    </w:p>
+    <w:p>
+      <w:pPr>
+        <w:rPr>
+          <w:rFonts w:ascii="Times New Roman" w:hAnsi="Times New Roman" w:cs="Times New Roman"/>
+          <w:sz w:val="36"/>
+          <w:szCs w:val="36"/>
+        </w:rPr>
+      </w:pPr>
+      <w:r>
+        <w:rPr>
+          <w:rFonts w:ascii="Times New Roman" w:hAnsi="Times New Roman" w:cs="Times New Roman"/>
+          <w:noProof/>
           <w:sz w:val="36"/>
           <w:szCs w:val="36"/>
         </w:rPr>
@@ -834,6 +774,7 @@
       <w:r>
         <w:rPr>
           <w:rFonts w:ascii="Times New Roman" w:hAnsi="Times New Roman" w:cs="Times New Roman"/>
+          <w:noProof/>
           <w:sz w:val="36"/>
           <w:szCs w:val="36"/>
         </w:rPr>
@@ -929,27 +870,7 @@
           <w:sz w:val="36"/>
           <w:szCs w:val="36"/>
         </w:rPr>
-        <w:t xml:space="preserve">DELETE </w:t>
-      </w:r>
-      <w:r>
-        <w:rPr>
-          <w:rFonts w:ascii="Times New Roman" w:hAnsi="Times New Roman" w:cs="Times New Roman"/>
-          <w:b/>
-          <w:bCs/>
-          <w:sz w:val="36"/>
-          <w:szCs w:val="36"/>
-        </w:rPr>
-        <w:t xml:space="preserve"> P</w:t>
-      </w:r>
-      <w:r>
-        <w:rPr>
-          <w:rFonts w:ascii="Times New Roman" w:hAnsi="Times New Roman" w:cs="Times New Roman"/>
-          <w:b/>
-          <w:bCs/>
-          <w:sz w:val="36"/>
-          <w:szCs w:val="36"/>
-        </w:rPr>
-        <w:t>roduct</w:t>
+        <w:t>DELETE  Product</w:t>
       </w:r>
       <w:proofErr w:type="gramEnd"/>
     </w:p>
@@ -975,6 +896,7 @@
       <w:r>
         <w:rPr>
           <w:rFonts w:ascii="Times New Roman" w:hAnsi="Times New Roman" w:cs="Times New Roman"/>
+          <w:noProof/>
           <w:sz w:val="36"/>
           <w:szCs w:val="36"/>
         </w:rPr>
@@ -1057,6 +979,7 @@
       <w:r>
         <w:rPr>
           <w:rFonts w:ascii="Times New Roman" w:hAnsi="Times New Roman" w:cs="Times New Roman"/>
+          <w:noProof/>
           <w:sz w:val="36"/>
           <w:szCs w:val="36"/>
         </w:rPr>
@@ -1160,6 +1083,7 @@
       <w:r>
         <w:rPr>
           <w:rFonts w:ascii="Times New Roman" w:hAnsi="Times New Roman" w:cs="Times New Roman"/>
+          <w:noProof/>
           <w:sz w:val="36"/>
           <w:szCs w:val="36"/>
         </w:rPr>
@@ -1233,6 +1157,7 @@
       <w:r>
         <w:rPr>
           <w:rFonts w:ascii="Times New Roman" w:hAnsi="Times New Roman" w:cs="Times New Roman"/>
+          <w:noProof/>
           <w:sz w:val="36"/>
           <w:szCs w:val="36"/>
         </w:rPr>
@@ -1362,6 +1287,7 @@
       <w:r>
         <w:rPr>
           <w:rFonts w:ascii="Times New Roman" w:hAnsi="Times New Roman" w:cs="Times New Roman"/>
+          <w:noProof/>
           <w:sz w:val="36"/>
           <w:szCs w:val="36"/>
         </w:rPr>
@@ -1426,6 +1352,7 @@
       <w:r>
         <w:rPr>
           <w:rFonts w:ascii="Times New Roman" w:hAnsi="Times New Roman" w:cs="Times New Roman"/>
+          <w:noProof/>
           <w:sz w:val="36"/>
           <w:szCs w:val="36"/>
         </w:rPr>
@@ -1540,6 +1467,7 @@
       <w:r>
         <w:rPr>
           <w:rFonts w:ascii="Times New Roman" w:hAnsi="Times New Roman" w:cs="Times New Roman"/>
+          <w:noProof/>
           <w:sz w:val="36"/>
           <w:szCs w:val="36"/>
         </w:rPr>
@@ -1613,6 +1541,7 @@
       <w:r>
         <w:rPr>
           <w:rFonts w:ascii="Times New Roman" w:hAnsi="Times New Roman" w:cs="Times New Roman"/>
+          <w:noProof/>
           <w:sz w:val="36"/>
           <w:szCs w:val="36"/>
         </w:rPr>
@@ -1720,6 +1649,7 @@
       <w:r>
         <w:rPr>
           <w:rFonts w:ascii="Times New Roman" w:hAnsi="Times New Roman" w:cs="Times New Roman"/>
+          <w:noProof/>
           <w:sz w:val="36"/>
           <w:szCs w:val="36"/>
         </w:rPr>
@@ -1806,6 +1736,7 @@
       <w:r>
         <w:rPr>
           <w:rFonts w:ascii="Times New Roman" w:hAnsi="Times New Roman" w:cs="Times New Roman"/>
+          <w:noProof/>
           <w:sz w:val="36"/>
           <w:szCs w:val="36"/>
         </w:rPr>
@@ -1867,6 +1798,35 @@
           <w:szCs w:val="36"/>
         </w:rPr>
       </w:pPr>
+      <w:r>
+        <w:rPr>
+          <w:rFonts w:ascii="Times New Roman" w:hAnsi="Times New Roman" w:cs="Times New Roman"/>
+          <w:b/>
+          <w:bCs/>
+          <w:sz w:val="36"/>
+          <w:szCs w:val="36"/>
+        </w:rPr>
+        <w:t>GitHub Repository:</w:t>
+      </w:r>
+      <w:r>
+        <w:rPr>
+          <w:rFonts w:ascii="Times New Roman" w:hAnsi="Times New Roman" w:cs="Times New Roman"/>
+          <w:sz w:val="36"/>
+          <w:szCs w:val="36"/>
+        </w:rPr>
+        <w:t xml:space="preserve"> </w:t>
+      </w:r>
+      <w:hyperlink r:id="rId26" w:tgtFrame="_new" w:history="1">
+        <w:r>
+          <w:rPr>
+            <w:rStyle w:val="Hyperlink"/>
+            <w:rFonts w:ascii="Times New Roman" w:hAnsi="Times New Roman" w:cs="Times New Roman"/>
+            <w:sz w:val="36"/>
+            <w:szCs w:val="36"/>
+          </w:rPr>
+          <w:t>https://github.com/saikamvennela/secure-product-api</w:t>
+        </w:r>
+      </w:hyperlink>
     </w:p>
     <w:p>
       <w:pPr>
@@ -1909,11 +1869,12 @@
       <w:r>
         <w:rPr>
           <w:rFonts w:ascii="Times New Roman" w:hAnsi="Times New Roman" w:cs="Times New Roman"/>
+          <w:noProof/>
           <w:sz w:val="36"/>
           <w:szCs w:val="36"/>
         </w:rPr>
         <w:drawing>
-          <wp:inline distT="0" distB="0" distL="0" distR="0" wp14:anchorId="75417000" wp14:editId="6AA86601">
+          <wp:inline distT="0" distB="0" distL="0" distR="0" wp14:anchorId="75417000" wp14:editId="45F3816E">
             <wp:extent cx="5731510" cy="3451860"/>
             <wp:effectExtent l="0" t="0" r="2540" b="0"/>
             <wp:docPr id="1954475832" name="Picture 44"/>
@@ -1930,7 +1891,7 @@
                     </pic:cNvPicPr>
                   </pic:nvPicPr>
                   <pic:blipFill>
-                    <a:blip r:embed="rId26" cstate="print">
+                    <a:blip r:embed="rId27" cstate="print">
                       <a:extLst>
                         <a:ext uri="{28A0092B-C50C-407E-A947-70E740481C1C}">
                           <a14:useLocalDpi xmlns:a14="http://schemas.microsoft.com/office/drawing/2010/main" val="0"/>
@@ -1970,13 +1931,31 @@
           <w:szCs w:val="36"/>
         </w:rPr>
       </w:pPr>
-      <w:r>
-        <w:rPr>
-          <w:rFonts w:ascii="Times New Roman" w:hAnsi="Times New Roman" w:cs="Times New Roman"/>
-          <w:sz w:val="36"/>
-          <w:szCs w:val="36"/>
-        </w:rPr>
-        <w:lastRenderedPageBreak/>
+    </w:p>
+    <w:p>
+      <w:pPr>
+        <w:rPr>
+          <w:rFonts w:ascii="Times New Roman" w:hAnsi="Times New Roman" w:cs="Times New Roman"/>
+          <w:sz w:val="36"/>
+          <w:szCs w:val="36"/>
+        </w:rPr>
+      </w:pPr>
+    </w:p>
+    <w:p>
+      <w:pPr>
+        <w:rPr>
+          <w:rFonts w:ascii="Times New Roman" w:hAnsi="Times New Roman" w:cs="Times New Roman"/>
+          <w:sz w:val="36"/>
+          <w:szCs w:val="36"/>
+        </w:rPr>
+      </w:pPr>
+      <w:r>
+        <w:rPr>
+          <w:rFonts w:ascii="Times New Roman" w:hAnsi="Times New Roman" w:cs="Times New Roman"/>
+          <w:noProof/>
+          <w:sz w:val="36"/>
+          <w:szCs w:val="36"/>
+        </w:rPr>
         <w:drawing>
           <wp:inline distT="0" distB="0" distL="0" distR="0" wp14:anchorId="7F12E394" wp14:editId="6286DBBA">
             <wp:extent cx="5731510" cy="3604260"/>
@@ -1995,7 +1974,7 @@
                     </pic:cNvPicPr>
                   </pic:nvPicPr>
                   <pic:blipFill>
-                    <a:blip r:embed="rId27" cstate="print">
+                    <a:blip r:embed="rId28" cstate="print">
                       <a:extLst>
                         <a:ext uri="{28A0092B-C50C-407E-A947-70E740481C1C}">
                           <a14:useLocalDpi xmlns:a14="http://schemas.microsoft.com/office/drawing/2010/main" val="0"/>
@@ -2056,6 +2035,7 @@
       <w:r>
         <w:rPr>
           <w:rFonts w:ascii="Times New Roman" w:hAnsi="Times New Roman" w:cs="Times New Roman"/>
+          <w:noProof/>
           <w:sz w:val="36"/>
           <w:szCs w:val="36"/>
         </w:rPr>
@@ -2077,7 +2057,7 @@
                     </pic:cNvPicPr>
                   </pic:nvPicPr>
                   <pic:blipFill>
-                    <a:blip r:embed="rId28" cstate="print">
+                    <a:blip r:embed="rId29" cstate="print">
                       <a:extLst>
                         <a:ext uri="{28A0092B-C50C-407E-A947-70E740481C1C}">
                           <a14:useLocalDpi xmlns:a14="http://schemas.microsoft.com/office/drawing/2010/main" val="0"/>
@@ -2145,7 +2125,6 @@
           <w:sz w:val="36"/>
           <w:szCs w:val="36"/>
         </w:rPr>
-        <w:lastRenderedPageBreak/>
         <w:t>Description</w:t>
       </w:r>
     </w:p>
@@ -2498,6 +2477,7 @@
           <w:sz w:val="32"/>
           <w:szCs w:val="32"/>
         </w:rPr>
+        <w:lastRenderedPageBreak/>
         <w:t>Rate Limiting</w:t>
       </w:r>
       <w:r>
@@ -2559,7 +2539,6 @@
           <w:sz w:val="36"/>
           <w:szCs w:val="36"/>
         </w:rPr>
-        <w:lastRenderedPageBreak/>
         <w:t>Advantages</w:t>
       </w:r>
     </w:p>
@@ -2938,16 +2917,7 @@
           <w:sz w:val="32"/>
           <w:szCs w:val="32"/>
         </w:rPr>
-        <w:t xml:space="preserve">The Secure Product Catalog API demonstrates how to develop a secure and structured REST API using Node.js, Express.js, and </w:t>
-      </w:r>
-      <w:r>
-        <w:rPr>
-          <w:rFonts w:asciiTheme="majorHAnsi" w:hAnsiTheme="majorHAnsi" w:cstheme="majorHAnsi"/>
-          <w:sz w:val="32"/>
-          <w:szCs w:val="32"/>
-        </w:rPr>
-        <w:lastRenderedPageBreak/>
-        <w:t>TypeScript. The project implements complete CRUD operations along with API versioning, input validation, sanitization, appropriate HTTP status codes, consistent JSON responses, centralized error handling, rate limiting, Helmet security, and request body size restrictions.</w:t>
+        <w:t>The Secure Product Catalog API demonstrates how to develop a secure and structured REST API using Node.js, Express.js, and TypeScript. The project implements complete CRUD operations along with API versioning, input validation, sanitization, appropriate HTTP status codes, consistent JSON responses, centralized error handling, rate limiting, Helmet security, and request body size restrictions.</w:t>
       </w:r>
     </w:p>
     <w:p>

</xml_diff>